<commit_message>
docs: regenerate Task4 charts with pyramid signals, fix Task1 quotation marks
</commit_message>
<xml_diff>
--- a/Task4/Rebecca+Task4.docx
+++ b/Task4/Rebecca+Task4.docx
@@ -227,6 +227,34 @@
           <w:sz w:val="21"/>
         </w:rPr>
         <w:t>(6) 双系统过滤（Two-System Approach）：海龟策略包含两个子系统：System 1（20 日突破入场 + 10 日突破离场）和 System 2（55 日突破入场 + 20 日突破离场）。双系统并行运行，互为补充——System 1 更敏感但假信号多，System 2 更稳健但信号少。</w:t>
+      </w:r>
+    </w:p>
+    <w:p>
+      <w:pPr>
+        <w:spacing w:before="0" w:after="0" w:line="360" w:lineRule="auto"/>
+        <w:jc w:val="both"/>
+      </w:pPr>
+      <w:r>
+        <w:rPr>
+          <w:rFonts w:eastAsia="宋体" w:ascii="宋体" w:hAnsi="宋体"/>
+          <w:b w:val="0"/>
+          <w:sz w:val="21"/>
+        </w:rPr>
+      </w:r>
+    </w:p>
+    <w:p>
+      <w:pPr>
+        <w:spacing w:before="0" w:after="0" w:line="360" w:lineRule="auto"/>
+        <w:ind w:firstLine="420"/>
+        <w:jc w:val="both"/>
+      </w:pPr>
+      <w:r>
+        <w:rPr>
+          <w:rFonts w:eastAsia="宋体" w:ascii="宋体" w:hAnsi="宋体"/>
+          <w:b w:val="0"/>
+          <w:sz w:val="21"/>
+        </w:rPr>
+        <w:t>本次实现仅做多方向（Long-only），不包含做空。A 股市场做空机制受限（融券门槛高、标的少），且仅做多设计可与 Task3 双均线策略直接横向对比。在持续下跌行情中，策略通过空仓降低损失，而无法像原版海龟那样通过做空从下跌中获利。</w:t>
       </w:r>
     </w:p>
     <w:p>
@@ -921,7 +949,7 @@
           <w:b w:val="0"/>
           <w:sz w:val="21"/>
         </w:rPr>
-        <w:t>图1展示了价格、入场通道（20日最高价）和离场通道（10日最低价）。共产生5 次完整交易，其中止损退出 5 次，信号退出 0 次。红色▲标记买入点——每次突破 20 日高点后入场；绿色▼标记卖出点——跌破 10 日低点或触及 2×ATR 止损线。</w:t>
+        <w:t>图1展示了价格、入场通道（20日最高价）和离场通道（10日最低价）。共产生5 次完整交易，其中止损退出 5 次，信号退出 0 次。红色▲标记买入点——每次突破 20 日高点后入场；橙色◆标记加仓点——价格每上涨 0.5×ATR 加仓一个单位，最多加仓 4 次（金字塔加仓），共 7 次加仓；绿色▼标记卖出点——跌破 10 日低点或触及 2×ATR 止损线。</w:t>
       </w:r>
     </w:p>
     <w:p>
@@ -1085,7 +1113,7 @@
           <w:b w:val="0"/>
           <w:sz w:val="21"/>
         </w:rPr>
-        <w:t>策略累计回报 -1.58%，年化 -1.00%，最大回撤 -7.12%，夏普比率 -0.6660。买入持有累计回报 -18.24%。策略相对基准跑赢16.66 个百分点。回撤曲线显示，策略的回撤主要发生在趋势反转初期——此时离场信号尚未触发，而价格已经出现显著回落。这是趋势跟踪策略的固有特征。</w:t>
+        <w:t>策略累计回报 -2.21%，年化 -1.40%，最大回撤 -8.60%，夏普比率 -0.5783。买入持有累计回报 -18.24%。策略相对基准跑赢16.03 个百分点。回撤曲线显示，策略的回撤主要发生在趋势反转初期——此时离场信号尚未触发，而价格已经出现显著回落。这是趋势跟踪策略的固有特征。</w:t>
       </w:r>
     </w:p>
     <w:p>
@@ -1209,7 +1237,7 @@
                 <w:rFonts w:eastAsia="宋体" w:ascii="宋体" w:hAnsi="宋体"/>
                 <w:sz w:val="18"/>
               </w:rPr>
-              <w:t>-1.58%</w:t>
+              <w:t>-2.21%</w:t>
             </w:r>
           </w:p>
         </w:tc>
@@ -1265,7 +1293,7 @@
                 <w:rFonts w:eastAsia="宋体" w:ascii="宋体" w:hAnsi="宋体"/>
                 <w:sz w:val="18"/>
               </w:rPr>
-              <w:t>-1.00%</w:t>
+              <w:t>-1.40%</w:t>
             </w:r>
           </w:p>
         </w:tc>
@@ -1321,7 +1349,7 @@
                 <w:rFonts w:eastAsia="宋体" w:ascii="宋体" w:hAnsi="宋体"/>
                 <w:sz w:val="18"/>
               </w:rPr>
-              <w:t>-7.12%</w:t>
+              <w:t>-8.60%</w:t>
             </w:r>
           </w:p>
         </w:tc>
@@ -1377,7 +1405,7 @@
                 <w:rFonts w:eastAsia="宋体" w:ascii="宋体" w:hAnsi="宋体"/>
                 <w:sz w:val="18"/>
               </w:rPr>
-              <w:t>-0.6660</w:t>
+              <w:t>-0.5783</w:t>
             </w:r>
           </w:p>
         </w:tc>
@@ -1489,7 +1517,7 @@
                 <w:rFonts w:eastAsia="宋体" w:ascii="宋体" w:hAnsi="宋体"/>
                 <w:sz w:val="18"/>
               </w:rPr>
-              <w:t>1.39</w:t>
+              <w:t>0.80</w:t>
             </w:r>
           </w:p>
         </w:tc>
@@ -1963,7 +1991,7 @@
                 <w:rFonts w:eastAsia="宋体" w:ascii="宋体" w:hAnsi="宋体"/>
                 <w:sz w:val="18"/>
               </w:rPr>
-              <w:t>+1.70%</w:t>
+              <w:t>+1.27%</w:t>
             </w:r>
           </w:p>
         </w:tc>
@@ -1981,7 +2009,7 @@
                 <w:rFonts w:eastAsia="宋体" w:ascii="宋体" w:hAnsi="宋体"/>
                 <w:sz w:val="18"/>
               </w:rPr>
-              <w:t>+1.70%</w:t>
+              <w:t>+1.27%</w:t>
             </w:r>
           </w:p>
         </w:tc>
@@ -2000,6 +2028,486 @@
                 <w:sz w:val="18"/>
               </w:rPr>
               <w:t>止损</w:t>
+            </w:r>
+          </w:p>
+        </w:tc>
+      </w:tr>
+      <w:tr>
+        <w:tc>
+          <w:tcPr>
+            <w:tcW w:type="dxa" w:w="959"/>
+          </w:tcPr>
+          <w:p>
+            <w:pPr>
+              <w:jc w:val="center"/>
+            </w:pPr>
+            <w:r/>
+            <w:r>
+              <w:rPr>
+                <w:rFonts w:eastAsia="宋体" w:ascii="宋体" w:hAnsi="宋体"/>
+                <w:sz w:val="18"/>
+              </w:rPr>
+              <w:t xml:space="preserve">  +加仓</w:t>
+            </w:r>
+          </w:p>
+        </w:tc>
+        <w:tc>
+          <w:tcPr>
+            <w:tcW w:type="dxa" w:w="959"/>
+          </w:tcPr>
+          <w:p>
+            <w:pPr>
+              <w:jc w:val="center"/>
+            </w:pPr>
+            <w:r/>
+            <w:r>
+              <w:rPr>
+                <w:rFonts w:eastAsia="宋体" w:ascii="宋体" w:hAnsi="宋体"/>
+                <w:sz w:val="18"/>
+              </w:rPr>
+              <w:t>2025-07-18</w:t>
+            </w:r>
+          </w:p>
+        </w:tc>
+        <w:tc>
+          <w:tcPr>
+            <w:tcW w:type="dxa" w:w="959"/>
+          </w:tcPr>
+          <w:p>
+            <w:pPr>
+              <w:jc w:val="center"/>
+            </w:pPr>
+            <w:r/>
+            <w:r>
+              <w:rPr>
+                <w:rFonts w:eastAsia="宋体" w:ascii="宋体" w:hAnsi="宋体"/>
+                <w:sz w:val="18"/>
+              </w:rPr>
+              <w:t>1385.16</w:t>
+            </w:r>
+          </w:p>
+        </w:tc>
+        <w:tc>
+          <w:tcPr>
+            <w:tcW w:type="dxa" w:w="959"/>
+          </w:tcPr>
+          <w:p>
+            <w:pPr>
+              <w:jc w:val="center"/>
+            </w:pPr>
+            <w:r/>
+            <w:r>
+              <w:rPr>
+                <w:rFonts w:eastAsia="宋体" w:ascii="宋体" w:hAnsi="宋体"/>
+                <w:sz w:val="18"/>
+              </w:rPr>
+            </w:r>
+          </w:p>
+        </w:tc>
+        <w:tc>
+          <w:tcPr>
+            <w:tcW w:type="dxa" w:w="959"/>
+          </w:tcPr>
+          <w:p>
+            <w:pPr>
+              <w:jc w:val="center"/>
+            </w:pPr>
+            <w:r/>
+            <w:r>
+              <w:rPr>
+                <w:rFonts w:eastAsia="宋体" w:ascii="宋体" w:hAnsi="宋体"/>
+                <w:sz w:val="18"/>
+              </w:rPr>
+            </w:r>
+          </w:p>
+        </w:tc>
+        <w:tc>
+          <w:tcPr>
+            <w:tcW w:type="dxa" w:w="959"/>
+          </w:tcPr>
+          <w:p>
+            <w:pPr>
+              <w:jc w:val="center"/>
+            </w:pPr>
+            <w:r/>
+            <w:r>
+              <w:rPr>
+                <w:rFonts w:eastAsia="宋体" w:ascii="宋体" w:hAnsi="宋体"/>
+                <w:sz w:val="18"/>
+              </w:rPr>
+              <w:t>+175股</w:t>
+            </w:r>
+          </w:p>
+        </w:tc>
+        <w:tc>
+          <w:tcPr>
+            <w:tcW w:type="dxa" w:w="959"/>
+          </w:tcPr>
+          <w:p>
+            <w:pPr>
+              <w:jc w:val="center"/>
+            </w:pPr>
+            <w:r/>
+            <w:r>
+              <w:rPr>
+                <w:rFonts w:eastAsia="宋体" w:ascii="宋体" w:hAnsi="宋体"/>
+                <w:sz w:val="18"/>
+              </w:rPr>
+            </w:r>
+          </w:p>
+        </w:tc>
+        <w:tc>
+          <w:tcPr>
+            <w:tcW w:type="dxa" w:w="959"/>
+          </w:tcPr>
+          <w:p>
+            <w:pPr>
+              <w:jc w:val="center"/>
+            </w:pPr>
+            <w:r/>
+            <w:r>
+              <w:rPr>
+                <w:rFonts w:eastAsia="宋体" w:ascii="宋体" w:hAnsi="宋体"/>
+                <w:sz w:val="18"/>
+              </w:rPr>
+            </w:r>
+          </w:p>
+        </w:tc>
+        <w:tc>
+          <w:tcPr>
+            <w:tcW w:type="dxa" w:w="959"/>
+          </w:tcPr>
+          <w:p>
+            <w:pPr>
+              <w:jc w:val="center"/>
+            </w:pPr>
+            <w:r/>
+            <w:r>
+              <w:rPr>
+                <w:rFonts w:eastAsia="宋体" w:ascii="宋体" w:hAnsi="宋体"/>
+                <w:sz w:val="18"/>
+              </w:rPr>
+              <w:t>金字塔 (unit ?)</w:t>
+            </w:r>
+          </w:p>
+        </w:tc>
+      </w:tr>
+      <w:tr>
+        <w:tc>
+          <w:tcPr>
+            <w:tcW w:type="dxa" w:w="959"/>
+          </w:tcPr>
+          <w:p>
+            <w:pPr>
+              <w:jc w:val="center"/>
+            </w:pPr>
+            <w:r/>
+            <w:r>
+              <w:rPr>
+                <w:rFonts w:eastAsia="宋体" w:ascii="宋体" w:hAnsi="宋体"/>
+                <w:sz w:val="18"/>
+              </w:rPr>
+              <w:t xml:space="preserve">  +加仓</w:t>
+            </w:r>
+          </w:p>
+        </w:tc>
+        <w:tc>
+          <w:tcPr>
+            <w:tcW w:type="dxa" w:w="959"/>
+          </w:tcPr>
+          <w:p>
+            <w:pPr>
+              <w:jc w:val="center"/>
+            </w:pPr>
+            <w:r/>
+            <w:r>
+              <w:rPr>
+                <w:rFonts w:eastAsia="宋体" w:ascii="宋体" w:hAnsi="宋体"/>
+                <w:sz w:val="18"/>
+              </w:rPr>
+              <w:t>2025-07-22</w:t>
+            </w:r>
+          </w:p>
+        </w:tc>
+        <w:tc>
+          <w:tcPr>
+            <w:tcW w:type="dxa" w:w="959"/>
+          </w:tcPr>
+          <w:p>
+            <w:pPr>
+              <w:jc w:val="center"/>
+            </w:pPr>
+            <w:r/>
+            <w:r>
+              <w:rPr>
+                <w:rFonts w:eastAsia="宋体" w:ascii="宋体" w:hAnsi="宋体"/>
+                <w:sz w:val="18"/>
+              </w:rPr>
+              <w:t>1413.14</w:t>
+            </w:r>
+          </w:p>
+        </w:tc>
+        <w:tc>
+          <w:tcPr>
+            <w:tcW w:type="dxa" w:w="959"/>
+          </w:tcPr>
+          <w:p>
+            <w:pPr>
+              <w:jc w:val="center"/>
+            </w:pPr>
+            <w:r/>
+            <w:r>
+              <w:rPr>
+                <w:rFonts w:eastAsia="宋体" w:ascii="宋体" w:hAnsi="宋体"/>
+                <w:sz w:val="18"/>
+              </w:rPr>
+            </w:r>
+          </w:p>
+        </w:tc>
+        <w:tc>
+          <w:tcPr>
+            <w:tcW w:type="dxa" w:w="959"/>
+          </w:tcPr>
+          <w:p>
+            <w:pPr>
+              <w:jc w:val="center"/>
+            </w:pPr>
+            <w:r/>
+            <w:r>
+              <w:rPr>
+                <w:rFonts w:eastAsia="宋体" w:ascii="宋体" w:hAnsi="宋体"/>
+                <w:sz w:val="18"/>
+              </w:rPr>
+            </w:r>
+          </w:p>
+        </w:tc>
+        <w:tc>
+          <w:tcPr>
+            <w:tcW w:type="dxa" w:w="959"/>
+          </w:tcPr>
+          <w:p>
+            <w:pPr>
+              <w:jc w:val="center"/>
+            </w:pPr>
+            <w:r/>
+            <w:r>
+              <w:rPr>
+                <w:rFonts w:eastAsia="宋体" w:ascii="宋体" w:hAnsi="宋体"/>
+                <w:sz w:val="18"/>
+              </w:rPr>
+              <w:t>+49股</w:t>
+            </w:r>
+          </w:p>
+        </w:tc>
+        <w:tc>
+          <w:tcPr>
+            <w:tcW w:type="dxa" w:w="959"/>
+          </w:tcPr>
+          <w:p>
+            <w:pPr>
+              <w:jc w:val="center"/>
+            </w:pPr>
+            <w:r/>
+            <w:r>
+              <w:rPr>
+                <w:rFonts w:eastAsia="宋体" w:ascii="宋体" w:hAnsi="宋体"/>
+                <w:sz w:val="18"/>
+              </w:rPr>
+            </w:r>
+          </w:p>
+        </w:tc>
+        <w:tc>
+          <w:tcPr>
+            <w:tcW w:type="dxa" w:w="959"/>
+          </w:tcPr>
+          <w:p>
+            <w:pPr>
+              <w:jc w:val="center"/>
+            </w:pPr>
+            <w:r/>
+            <w:r>
+              <w:rPr>
+                <w:rFonts w:eastAsia="宋体" w:ascii="宋体" w:hAnsi="宋体"/>
+                <w:sz w:val="18"/>
+              </w:rPr>
+            </w:r>
+          </w:p>
+        </w:tc>
+        <w:tc>
+          <w:tcPr>
+            <w:tcW w:type="dxa" w:w="959"/>
+          </w:tcPr>
+          <w:p>
+            <w:pPr>
+              <w:jc w:val="center"/>
+            </w:pPr>
+            <w:r/>
+            <w:r>
+              <w:rPr>
+                <w:rFonts w:eastAsia="宋体" w:ascii="宋体" w:hAnsi="宋体"/>
+                <w:sz w:val="18"/>
+              </w:rPr>
+              <w:t>金字塔 (unit ?)</w:t>
+            </w:r>
+          </w:p>
+        </w:tc>
+      </w:tr>
+      <w:tr>
+        <w:tc>
+          <w:tcPr>
+            <w:tcW w:type="dxa" w:w="959"/>
+          </w:tcPr>
+          <w:p>
+            <w:pPr>
+              <w:jc w:val="center"/>
+            </w:pPr>
+            <w:r/>
+            <w:r>
+              <w:rPr>
+                <w:rFonts w:eastAsia="宋体" w:ascii="宋体" w:hAnsi="宋体"/>
+                <w:sz w:val="18"/>
+              </w:rPr>
+              <w:t xml:space="preserve">  +加仓</w:t>
+            </w:r>
+          </w:p>
+        </w:tc>
+        <w:tc>
+          <w:tcPr>
+            <w:tcW w:type="dxa" w:w="959"/>
+          </w:tcPr>
+          <w:p>
+            <w:pPr>
+              <w:jc w:val="center"/>
+            </w:pPr>
+            <w:r/>
+            <w:r>
+              <w:rPr>
+                <w:rFonts w:eastAsia="宋体" w:ascii="宋体" w:hAnsi="宋体"/>
+                <w:sz w:val="18"/>
+              </w:rPr>
+              <w:t>2025-07-23</w:t>
+            </w:r>
+          </w:p>
+        </w:tc>
+        <w:tc>
+          <w:tcPr>
+            <w:tcW w:type="dxa" w:w="959"/>
+          </w:tcPr>
+          <w:p>
+            <w:pPr>
+              <w:jc w:val="center"/>
+            </w:pPr>
+            <w:r/>
+            <w:r>
+              <w:rPr>
+                <w:rFonts w:eastAsia="宋体" w:ascii="宋体" w:hAnsi="宋体"/>
+                <w:sz w:val="18"/>
+              </w:rPr>
+              <w:t>1423.66</w:t>
+            </w:r>
+          </w:p>
+        </w:tc>
+        <w:tc>
+          <w:tcPr>
+            <w:tcW w:type="dxa" w:w="959"/>
+          </w:tcPr>
+          <w:p>
+            <w:pPr>
+              <w:jc w:val="center"/>
+            </w:pPr>
+            <w:r/>
+            <w:r>
+              <w:rPr>
+                <w:rFonts w:eastAsia="宋体" w:ascii="宋体" w:hAnsi="宋体"/>
+                <w:sz w:val="18"/>
+              </w:rPr>
+            </w:r>
+          </w:p>
+        </w:tc>
+        <w:tc>
+          <w:tcPr>
+            <w:tcW w:type="dxa" w:w="959"/>
+          </w:tcPr>
+          <w:p>
+            <w:pPr>
+              <w:jc w:val="center"/>
+            </w:pPr>
+            <w:r/>
+            <w:r>
+              <w:rPr>
+                <w:rFonts w:eastAsia="宋体" w:ascii="宋体" w:hAnsi="宋体"/>
+                <w:sz w:val="18"/>
+              </w:rPr>
+            </w:r>
+          </w:p>
+        </w:tc>
+        <w:tc>
+          <w:tcPr>
+            <w:tcW w:type="dxa" w:w="959"/>
+          </w:tcPr>
+          <w:p>
+            <w:pPr>
+              <w:jc w:val="center"/>
+            </w:pPr>
+            <w:r/>
+            <w:r>
+              <w:rPr>
+                <w:rFonts w:eastAsia="宋体" w:ascii="宋体" w:hAnsi="宋体"/>
+                <w:sz w:val="18"/>
+              </w:rPr>
+              <w:t>+13股</w:t>
+            </w:r>
+          </w:p>
+        </w:tc>
+        <w:tc>
+          <w:tcPr>
+            <w:tcW w:type="dxa" w:w="959"/>
+          </w:tcPr>
+          <w:p>
+            <w:pPr>
+              <w:jc w:val="center"/>
+            </w:pPr>
+            <w:r/>
+            <w:r>
+              <w:rPr>
+                <w:rFonts w:eastAsia="宋体" w:ascii="宋体" w:hAnsi="宋体"/>
+                <w:sz w:val="18"/>
+              </w:rPr>
+            </w:r>
+          </w:p>
+        </w:tc>
+        <w:tc>
+          <w:tcPr>
+            <w:tcW w:type="dxa" w:w="959"/>
+          </w:tcPr>
+          <w:p>
+            <w:pPr>
+              <w:jc w:val="center"/>
+            </w:pPr>
+            <w:r/>
+            <w:r>
+              <w:rPr>
+                <w:rFonts w:eastAsia="宋体" w:ascii="宋体" w:hAnsi="宋体"/>
+                <w:sz w:val="18"/>
+              </w:rPr>
+            </w:r>
+          </w:p>
+        </w:tc>
+        <w:tc>
+          <w:tcPr>
+            <w:tcW w:type="dxa" w:w="959"/>
+          </w:tcPr>
+          <w:p>
+            <w:pPr>
+              <w:jc w:val="center"/>
+            </w:pPr>
+            <w:r/>
+            <w:r>
+              <w:rPr>
+                <w:rFonts w:eastAsia="宋体" w:ascii="宋体" w:hAnsi="宋体"/>
+                <w:sz w:val="18"/>
+              </w:rPr>
+              <w:t>金字塔 (unit ?)</w:t>
             </w:r>
           </w:p>
         </w:tc>
@@ -2145,7 +2653,7 @@
                 <w:rFonts w:eastAsia="宋体" w:ascii="宋体" w:hAnsi="宋体"/>
                 <w:sz w:val="18"/>
               </w:rPr>
-              <w:t>-1.05%</w:t>
+              <w:t>-1.46%</w:t>
             </w:r>
           </w:p>
         </w:tc>
@@ -2291,7 +2799,7 @@
                 <w:rFonts w:eastAsia="宋体" w:ascii="宋体" w:hAnsi="宋体"/>
                 <w:sz w:val="18"/>
               </w:rPr>
-              <w:t>-1.89%</w:t>
+              <w:t>-2.17%</w:t>
             </w:r>
           </w:p>
         </w:tc>
@@ -2309,7 +2817,7 @@
                 <w:rFonts w:eastAsia="宋体" w:ascii="宋体" w:hAnsi="宋体"/>
                 <w:sz w:val="18"/>
               </w:rPr>
-              <w:t>-2.92%</w:t>
+              <w:t>-3.60%</w:t>
             </w:r>
           </w:p>
         </w:tc>
@@ -2328,6 +2836,166 @@
                 <w:sz w:val="18"/>
               </w:rPr>
               <w:t>止损</w:t>
+            </w:r>
+          </w:p>
+        </w:tc>
+      </w:tr>
+      <w:tr>
+        <w:tc>
+          <w:tcPr>
+            <w:tcW w:type="dxa" w:w="959"/>
+          </w:tcPr>
+          <w:p>
+            <w:pPr>
+              <w:jc w:val="center"/>
+            </w:pPr>
+            <w:r/>
+            <w:r>
+              <w:rPr>
+                <w:rFonts w:eastAsia="宋体" w:ascii="宋体" w:hAnsi="宋体"/>
+                <w:sz w:val="18"/>
+              </w:rPr>
+              <w:t xml:space="preserve">  +加仓</w:t>
+            </w:r>
+          </w:p>
+        </w:tc>
+        <w:tc>
+          <w:tcPr>
+            <w:tcW w:type="dxa" w:w="959"/>
+          </w:tcPr>
+          <w:p>
+            <w:pPr>
+              <w:jc w:val="center"/>
+            </w:pPr>
+            <w:r/>
+            <w:r>
+              <w:rPr>
+                <w:rFonts w:eastAsia="宋体" w:ascii="宋体" w:hAnsi="宋体"/>
+                <w:sz w:val="18"/>
+              </w:rPr>
+              <w:t>2025-09-10</w:t>
+            </w:r>
+          </w:p>
+        </w:tc>
+        <w:tc>
+          <w:tcPr>
+            <w:tcW w:type="dxa" w:w="959"/>
+          </w:tcPr>
+          <w:p>
+            <w:pPr>
+              <w:jc w:val="center"/>
+            </w:pPr>
+            <w:r/>
+            <w:r>
+              <w:rPr>
+                <w:rFonts w:eastAsia="宋体" w:ascii="宋体" w:hAnsi="宋体"/>
+                <w:sz w:val="18"/>
+              </w:rPr>
+              <w:t>1470.18</w:t>
+            </w:r>
+          </w:p>
+        </w:tc>
+        <w:tc>
+          <w:tcPr>
+            <w:tcW w:type="dxa" w:w="959"/>
+          </w:tcPr>
+          <w:p>
+            <w:pPr>
+              <w:jc w:val="center"/>
+            </w:pPr>
+            <w:r/>
+            <w:r>
+              <w:rPr>
+                <w:rFonts w:eastAsia="宋体" w:ascii="宋体" w:hAnsi="宋体"/>
+                <w:sz w:val="18"/>
+              </w:rPr>
+            </w:r>
+          </w:p>
+        </w:tc>
+        <w:tc>
+          <w:tcPr>
+            <w:tcW w:type="dxa" w:w="959"/>
+          </w:tcPr>
+          <w:p>
+            <w:pPr>
+              <w:jc w:val="center"/>
+            </w:pPr>
+            <w:r/>
+            <w:r>
+              <w:rPr>
+                <w:rFonts w:eastAsia="宋体" w:ascii="宋体" w:hAnsi="宋体"/>
+                <w:sz w:val="18"/>
+              </w:rPr>
+            </w:r>
+          </w:p>
+        </w:tc>
+        <w:tc>
+          <w:tcPr>
+            <w:tcW w:type="dxa" w:w="959"/>
+          </w:tcPr>
+          <w:p>
+            <w:pPr>
+              <w:jc w:val="center"/>
+            </w:pPr>
+            <w:r/>
+            <w:r>
+              <w:rPr>
+                <w:rFonts w:eastAsia="宋体" w:ascii="宋体" w:hAnsi="宋体"/>
+                <w:sz w:val="18"/>
+              </w:rPr>
+              <w:t>+149股</w:t>
+            </w:r>
+          </w:p>
+        </w:tc>
+        <w:tc>
+          <w:tcPr>
+            <w:tcW w:type="dxa" w:w="959"/>
+          </w:tcPr>
+          <w:p>
+            <w:pPr>
+              <w:jc w:val="center"/>
+            </w:pPr>
+            <w:r/>
+            <w:r>
+              <w:rPr>
+                <w:rFonts w:eastAsia="宋体" w:ascii="宋体" w:hAnsi="宋体"/>
+                <w:sz w:val="18"/>
+              </w:rPr>
+            </w:r>
+          </w:p>
+        </w:tc>
+        <w:tc>
+          <w:tcPr>
+            <w:tcW w:type="dxa" w:w="959"/>
+          </w:tcPr>
+          <w:p>
+            <w:pPr>
+              <w:jc w:val="center"/>
+            </w:pPr>
+            <w:r/>
+            <w:r>
+              <w:rPr>
+                <w:rFonts w:eastAsia="宋体" w:ascii="宋体" w:hAnsi="宋体"/>
+                <w:sz w:val="18"/>
+              </w:rPr>
+            </w:r>
+          </w:p>
+        </w:tc>
+        <w:tc>
+          <w:tcPr>
+            <w:tcW w:type="dxa" w:w="959"/>
+          </w:tcPr>
+          <w:p>
+            <w:pPr>
+              <w:jc w:val="center"/>
+            </w:pPr>
+            <w:r/>
+            <w:r>
+              <w:rPr>
+                <w:rFonts w:eastAsia="宋体" w:ascii="宋体" w:hAnsi="宋体"/>
+                <w:sz w:val="18"/>
+              </w:rPr>
+              <w:t>金字塔 (unit ?)</w:t>
             </w:r>
           </w:p>
         </w:tc>
@@ -2473,7 +3141,7 @@
                 <w:rFonts w:eastAsia="宋体" w:ascii="宋体" w:hAnsi="宋体"/>
                 <w:sz w:val="18"/>
               </w:rPr>
-              <w:t>-5.30%</w:t>
+              <w:t>-5.97%</w:t>
             </w:r>
           </w:p>
         </w:tc>
@@ -2583,7 +3251,7 @@
                 <w:rFonts w:eastAsia="宋体" w:ascii="宋体" w:hAnsi="宋体"/>
                 <w:sz w:val="18"/>
               </w:rPr>
-              <w:t>1467.35</w:t>
+              <w:t>1467.51</w:t>
             </w:r>
           </w:p>
         </w:tc>
@@ -2619,7 +3287,7 @@
                 <w:rFonts w:eastAsia="宋体" w:ascii="宋体" w:hAnsi="宋体"/>
                 <w:sz w:val="18"/>
               </w:rPr>
-              <w:t>+4.81%</w:t>
+              <w:t>+2.64%</w:t>
             </w:r>
           </w:p>
         </w:tc>
@@ -2637,7 +3305,7 @@
                 <w:rFonts w:eastAsia="宋体" w:ascii="宋体" w:hAnsi="宋体"/>
                 <w:sz w:val="18"/>
               </w:rPr>
-              <w:t>-0.75%</w:t>
+              <w:t>-3.49%</w:t>
             </w:r>
           </w:p>
         </w:tc>
@@ -2656,6 +3324,486 @@
                 <w:sz w:val="18"/>
               </w:rPr>
               <w:t>止损</w:t>
+            </w:r>
+          </w:p>
+        </w:tc>
+      </w:tr>
+      <w:tr>
+        <w:tc>
+          <w:tcPr>
+            <w:tcW w:type="dxa" w:w="959"/>
+          </w:tcPr>
+          <w:p>
+            <w:pPr>
+              <w:jc w:val="center"/>
+            </w:pPr>
+            <w:r/>
+            <w:r>
+              <w:rPr>
+                <w:rFonts w:eastAsia="宋体" w:ascii="宋体" w:hAnsi="宋体"/>
+                <w:sz w:val="18"/>
+              </w:rPr>
+              <w:t xml:space="preserve">  +加仓</w:t>
+            </w:r>
+          </w:p>
+        </w:tc>
+        <w:tc>
+          <w:tcPr>
+            <w:tcW w:type="dxa" w:w="959"/>
+          </w:tcPr>
+          <w:p>
+            <w:pPr>
+              <w:jc w:val="center"/>
+            </w:pPr>
+            <w:r/>
+            <w:r>
+              <w:rPr>
+                <w:rFonts w:eastAsia="宋体" w:ascii="宋体" w:hAnsi="宋体"/>
+                <w:sz w:val="18"/>
+              </w:rPr>
+              <w:t>2026-02-03</w:t>
+            </w:r>
+          </w:p>
+        </w:tc>
+        <w:tc>
+          <w:tcPr>
+            <w:tcW w:type="dxa" w:w="959"/>
+          </w:tcPr>
+          <w:p>
+            <w:pPr>
+              <w:jc w:val="center"/>
+            </w:pPr>
+            <w:r/>
+            <w:r>
+              <w:rPr>
+                <w:rFonts w:eastAsia="宋体" w:ascii="宋体" w:hAnsi="宋体"/>
+                <w:sz w:val="18"/>
+              </w:rPr>
+              <w:t>1447.04</w:t>
+            </w:r>
+          </w:p>
+        </w:tc>
+        <w:tc>
+          <w:tcPr>
+            <w:tcW w:type="dxa" w:w="959"/>
+          </w:tcPr>
+          <w:p>
+            <w:pPr>
+              <w:jc w:val="center"/>
+            </w:pPr>
+            <w:r/>
+            <w:r>
+              <w:rPr>
+                <w:rFonts w:eastAsia="宋体" w:ascii="宋体" w:hAnsi="宋体"/>
+                <w:sz w:val="18"/>
+              </w:rPr>
+            </w:r>
+          </w:p>
+        </w:tc>
+        <w:tc>
+          <w:tcPr>
+            <w:tcW w:type="dxa" w:w="959"/>
+          </w:tcPr>
+          <w:p>
+            <w:pPr>
+              <w:jc w:val="center"/>
+            </w:pPr>
+            <w:r/>
+            <w:r>
+              <w:rPr>
+                <w:rFonts w:eastAsia="宋体" w:ascii="宋体" w:hAnsi="宋体"/>
+                <w:sz w:val="18"/>
+              </w:rPr>
+            </w:r>
+          </w:p>
+        </w:tc>
+        <w:tc>
+          <w:tcPr>
+            <w:tcW w:type="dxa" w:w="959"/>
+          </w:tcPr>
+          <w:p>
+            <w:pPr>
+              <w:jc w:val="center"/>
+            </w:pPr>
+            <w:r/>
+            <w:r>
+              <w:rPr>
+                <w:rFonts w:eastAsia="宋体" w:ascii="宋体" w:hAnsi="宋体"/>
+                <w:sz w:val="18"/>
+              </w:rPr>
+              <w:t>+162股</w:t>
+            </w:r>
+          </w:p>
+        </w:tc>
+        <w:tc>
+          <w:tcPr>
+            <w:tcW w:type="dxa" w:w="959"/>
+          </w:tcPr>
+          <w:p>
+            <w:pPr>
+              <w:jc w:val="center"/>
+            </w:pPr>
+            <w:r/>
+            <w:r>
+              <w:rPr>
+                <w:rFonts w:eastAsia="宋体" w:ascii="宋体" w:hAnsi="宋体"/>
+                <w:sz w:val="18"/>
+              </w:rPr>
+            </w:r>
+          </w:p>
+        </w:tc>
+        <w:tc>
+          <w:tcPr>
+            <w:tcW w:type="dxa" w:w="959"/>
+          </w:tcPr>
+          <w:p>
+            <w:pPr>
+              <w:jc w:val="center"/>
+            </w:pPr>
+            <w:r/>
+            <w:r>
+              <w:rPr>
+                <w:rFonts w:eastAsia="宋体" w:ascii="宋体" w:hAnsi="宋体"/>
+                <w:sz w:val="18"/>
+              </w:rPr>
+            </w:r>
+          </w:p>
+        </w:tc>
+        <w:tc>
+          <w:tcPr>
+            <w:tcW w:type="dxa" w:w="959"/>
+          </w:tcPr>
+          <w:p>
+            <w:pPr>
+              <w:jc w:val="center"/>
+            </w:pPr>
+            <w:r/>
+            <w:r>
+              <w:rPr>
+                <w:rFonts w:eastAsia="宋体" w:ascii="宋体" w:hAnsi="宋体"/>
+                <w:sz w:val="18"/>
+              </w:rPr>
+              <w:t>金字塔 (unit ?)</w:t>
+            </w:r>
+          </w:p>
+        </w:tc>
+      </w:tr>
+      <w:tr>
+        <w:tc>
+          <w:tcPr>
+            <w:tcW w:type="dxa" w:w="959"/>
+          </w:tcPr>
+          <w:p>
+            <w:pPr>
+              <w:jc w:val="center"/>
+            </w:pPr>
+            <w:r/>
+            <w:r>
+              <w:rPr>
+                <w:rFonts w:eastAsia="宋体" w:ascii="宋体" w:hAnsi="宋体"/>
+                <w:sz w:val="18"/>
+              </w:rPr>
+              <w:t xml:space="preserve">  +加仓</w:t>
+            </w:r>
+          </w:p>
+        </w:tc>
+        <w:tc>
+          <w:tcPr>
+            <w:tcW w:type="dxa" w:w="959"/>
+          </w:tcPr>
+          <w:p>
+            <w:pPr>
+              <w:jc w:val="center"/>
+            </w:pPr>
+            <w:r/>
+            <w:r>
+              <w:rPr>
+                <w:rFonts w:eastAsia="宋体" w:ascii="宋体" w:hAnsi="宋体"/>
+                <w:sz w:val="18"/>
+              </w:rPr>
+              <w:t>2026-02-04</w:t>
+            </w:r>
+          </w:p>
+        </w:tc>
+        <w:tc>
+          <w:tcPr>
+            <w:tcW w:type="dxa" w:w="959"/>
+          </w:tcPr>
+          <w:p>
+            <w:pPr>
+              <w:jc w:val="center"/>
+            </w:pPr>
+            <w:r/>
+            <w:r>
+              <w:rPr>
+                <w:rFonts w:eastAsia="宋体" w:ascii="宋体" w:hAnsi="宋体"/>
+                <w:sz w:val="18"/>
+              </w:rPr>
+              <w:t>1497.13</w:t>
+            </w:r>
+          </w:p>
+        </w:tc>
+        <w:tc>
+          <w:tcPr>
+            <w:tcW w:type="dxa" w:w="959"/>
+          </w:tcPr>
+          <w:p>
+            <w:pPr>
+              <w:jc w:val="center"/>
+            </w:pPr>
+            <w:r/>
+            <w:r>
+              <w:rPr>
+                <w:rFonts w:eastAsia="宋体" w:ascii="宋体" w:hAnsi="宋体"/>
+                <w:sz w:val="18"/>
+              </w:rPr>
+            </w:r>
+          </w:p>
+        </w:tc>
+        <w:tc>
+          <w:tcPr>
+            <w:tcW w:type="dxa" w:w="959"/>
+          </w:tcPr>
+          <w:p>
+            <w:pPr>
+              <w:jc w:val="center"/>
+            </w:pPr>
+            <w:r/>
+            <w:r>
+              <w:rPr>
+                <w:rFonts w:eastAsia="宋体" w:ascii="宋体" w:hAnsi="宋体"/>
+                <w:sz w:val="18"/>
+              </w:rPr>
+            </w:r>
+          </w:p>
+        </w:tc>
+        <w:tc>
+          <w:tcPr>
+            <w:tcW w:type="dxa" w:w="959"/>
+          </w:tcPr>
+          <w:p>
+            <w:pPr>
+              <w:jc w:val="center"/>
+            </w:pPr>
+            <w:r/>
+            <w:r>
+              <w:rPr>
+                <w:rFonts w:eastAsia="宋体" w:ascii="宋体" w:hAnsi="宋体"/>
+                <w:sz w:val="18"/>
+              </w:rPr>
+              <w:t>+71股</w:t>
+            </w:r>
+          </w:p>
+        </w:tc>
+        <w:tc>
+          <w:tcPr>
+            <w:tcW w:type="dxa" w:w="959"/>
+          </w:tcPr>
+          <w:p>
+            <w:pPr>
+              <w:jc w:val="center"/>
+            </w:pPr>
+            <w:r/>
+            <w:r>
+              <w:rPr>
+                <w:rFonts w:eastAsia="宋体" w:ascii="宋体" w:hAnsi="宋体"/>
+                <w:sz w:val="18"/>
+              </w:rPr>
+            </w:r>
+          </w:p>
+        </w:tc>
+        <w:tc>
+          <w:tcPr>
+            <w:tcW w:type="dxa" w:w="959"/>
+          </w:tcPr>
+          <w:p>
+            <w:pPr>
+              <w:jc w:val="center"/>
+            </w:pPr>
+            <w:r/>
+            <w:r>
+              <w:rPr>
+                <w:rFonts w:eastAsia="宋体" w:ascii="宋体" w:hAnsi="宋体"/>
+                <w:sz w:val="18"/>
+              </w:rPr>
+            </w:r>
+          </w:p>
+        </w:tc>
+        <w:tc>
+          <w:tcPr>
+            <w:tcW w:type="dxa" w:w="959"/>
+          </w:tcPr>
+          <w:p>
+            <w:pPr>
+              <w:jc w:val="center"/>
+            </w:pPr>
+            <w:r/>
+            <w:r>
+              <w:rPr>
+                <w:rFonts w:eastAsia="宋体" w:ascii="宋体" w:hAnsi="宋体"/>
+                <w:sz w:val="18"/>
+              </w:rPr>
+              <w:t>金字塔 (unit ?)</w:t>
+            </w:r>
+          </w:p>
+        </w:tc>
+      </w:tr>
+      <w:tr>
+        <w:tc>
+          <w:tcPr>
+            <w:tcW w:type="dxa" w:w="959"/>
+          </w:tcPr>
+          <w:p>
+            <w:pPr>
+              <w:jc w:val="center"/>
+            </w:pPr>
+            <w:r/>
+            <w:r>
+              <w:rPr>
+                <w:rFonts w:eastAsia="宋体" w:ascii="宋体" w:hAnsi="宋体"/>
+                <w:sz w:val="18"/>
+              </w:rPr>
+              <w:t xml:space="preserve">  +加仓</w:t>
+            </w:r>
+          </w:p>
+        </w:tc>
+        <w:tc>
+          <w:tcPr>
+            <w:tcW w:type="dxa" w:w="959"/>
+          </w:tcPr>
+          <w:p>
+            <w:pPr>
+              <w:jc w:val="center"/>
+            </w:pPr>
+            <w:r/>
+            <w:r>
+              <w:rPr>
+                <w:rFonts w:eastAsia="宋体" w:ascii="宋体" w:hAnsi="宋体"/>
+                <w:sz w:val="18"/>
+              </w:rPr>
+              <w:t>2026-02-05</w:t>
+            </w:r>
+          </w:p>
+        </w:tc>
+        <w:tc>
+          <w:tcPr>
+            <w:tcW w:type="dxa" w:w="959"/>
+          </w:tcPr>
+          <w:p>
+            <w:pPr>
+              <w:jc w:val="center"/>
+            </w:pPr>
+            <w:r/>
+            <w:r>
+              <w:rPr>
+                <w:rFonts w:eastAsia="宋体" w:ascii="宋体" w:hAnsi="宋体"/>
+                <w:sz w:val="18"/>
+              </w:rPr>
+              <w:t>1527.13</w:t>
+            </w:r>
+          </w:p>
+        </w:tc>
+        <w:tc>
+          <w:tcPr>
+            <w:tcW w:type="dxa" w:w="959"/>
+          </w:tcPr>
+          <w:p>
+            <w:pPr>
+              <w:jc w:val="center"/>
+            </w:pPr>
+            <w:r/>
+            <w:r>
+              <w:rPr>
+                <w:rFonts w:eastAsia="宋体" w:ascii="宋体" w:hAnsi="宋体"/>
+                <w:sz w:val="18"/>
+              </w:rPr>
+            </w:r>
+          </w:p>
+        </w:tc>
+        <w:tc>
+          <w:tcPr>
+            <w:tcW w:type="dxa" w:w="959"/>
+          </w:tcPr>
+          <w:p>
+            <w:pPr>
+              <w:jc w:val="center"/>
+            </w:pPr>
+            <w:r/>
+            <w:r>
+              <w:rPr>
+                <w:rFonts w:eastAsia="宋体" w:ascii="宋体" w:hAnsi="宋体"/>
+                <w:sz w:val="18"/>
+              </w:rPr>
+            </w:r>
+          </w:p>
+        </w:tc>
+        <w:tc>
+          <w:tcPr>
+            <w:tcW w:type="dxa" w:w="959"/>
+          </w:tcPr>
+          <w:p>
+            <w:pPr>
+              <w:jc w:val="center"/>
+            </w:pPr>
+            <w:r/>
+            <w:r>
+              <w:rPr>
+                <w:rFonts w:eastAsia="宋体" w:ascii="宋体" w:hAnsi="宋体"/>
+                <w:sz w:val="18"/>
+              </w:rPr>
+              <w:t>+33股</w:t>
+            </w:r>
+          </w:p>
+        </w:tc>
+        <w:tc>
+          <w:tcPr>
+            <w:tcW w:type="dxa" w:w="959"/>
+          </w:tcPr>
+          <w:p>
+            <w:pPr>
+              <w:jc w:val="center"/>
+            </w:pPr>
+            <w:r/>
+            <w:r>
+              <w:rPr>
+                <w:rFonts w:eastAsia="宋体" w:ascii="宋体" w:hAnsi="宋体"/>
+                <w:sz w:val="18"/>
+              </w:rPr>
+            </w:r>
+          </w:p>
+        </w:tc>
+        <w:tc>
+          <w:tcPr>
+            <w:tcW w:type="dxa" w:w="959"/>
+          </w:tcPr>
+          <w:p>
+            <w:pPr>
+              <w:jc w:val="center"/>
+            </w:pPr>
+            <w:r/>
+            <w:r>
+              <w:rPr>
+                <w:rFonts w:eastAsia="宋体" w:ascii="宋体" w:hAnsi="宋体"/>
+                <w:sz w:val="18"/>
+              </w:rPr>
+            </w:r>
+          </w:p>
+        </w:tc>
+        <w:tc>
+          <w:tcPr>
+            <w:tcW w:type="dxa" w:w="959"/>
+          </w:tcPr>
+          <w:p>
+            <w:pPr>
+              <w:jc w:val="center"/>
+            </w:pPr>
+            <w:r/>
+            <w:r>
+              <w:rPr>
+                <w:rFonts w:eastAsia="宋体" w:ascii="宋体" w:hAnsi="宋体"/>
+                <w:sz w:val="18"/>
+              </w:rPr>
+              <w:t>金字塔 (unit ?)</w:t>
             </w:r>
           </w:p>
         </w:tc>
@@ -2944,7 +4092,7 @@
       <w:r>
         <w:drawing>
           <wp:inline xmlns:a="http://schemas.openxmlformats.org/drawingml/2006/main" xmlns:pic="http://schemas.openxmlformats.org/drawingml/2006/picture">
-            <wp:extent cx="5303520" cy="1800482"/>
+            <wp:extent cx="5303520" cy="1799726"/>
             <wp:docPr id="6" name="Picture 6"/>
             <wp:cNvGraphicFramePr>
               <a:graphicFrameLocks noChangeAspect="1"/>
@@ -2965,7 +4113,7 @@
                   <pic:spPr>
                     <a:xfrm>
                       <a:off x="0" y="0"/>
-                      <a:ext cx="5303520" cy="1800482"/>
+                      <a:ext cx="5303520" cy="1799726"/>
                     </a:xfrm>
                     <a:prstGeom prst="rect"/>
                   </pic:spPr>
@@ -3262,7 +4410,7 @@
                 <w:rFonts w:eastAsia="宋体" w:ascii="宋体" w:hAnsi="宋体"/>
                 <w:sz w:val="18"/>
               </w:rPr>
-              <w:t>-1.58%</w:t>
+              <w:t>-2.21%</w:t>
             </w:r>
           </w:p>
         </w:tc>
@@ -3280,7 +4428,7 @@
                 <w:rFonts w:eastAsia="宋体" w:ascii="宋体" w:hAnsi="宋体"/>
                 <w:sz w:val="18"/>
               </w:rPr>
-              <w:t>-1.00%</w:t>
+              <w:t>-1.40%</w:t>
             </w:r>
           </w:p>
         </w:tc>
@@ -3298,7 +4446,7 @@
                 <w:rFonts w:eastAsia="宋体" w:ascii="宋体" w:hAnsi="宋体"/>
                 <w:sz w:val="18"/>
               </w:rPr>
-              <w:t>-7.12%</w:t>
+              <w:t>-8.60%</w:t>
             </w:r>
           </w:p>
         </w:tc>
@@ -3316,7 +4464,7 @@
                 <w:rFonts w:eastAsia="宋体" w:ascii="宋体" w:hAnsi="宋体"/>
                 <w:sz w:val="18"/>
               </w:rPr>
-              <w:t>-0.6660</w:t>
+              <w:t>-0.5783</w:t>
             </w:r>
           </w:p>
         </w:tc>
@@ -3444,7 +4592,7 @@
                 <w:rFonts w:eastAsia="宋体" w:ascii="宋体" w:hAnsi="宋体"/>
                 <w:sz w:val="18"/>
               </w:rPr>
-              <w:t>1.86%</w:t>
+              <w:t>1.14%</w:t>
             </w:r>
           </w:p>
         </w:tc>
@@ -3462,7 +4610,7 @@
                 <w:rFonts w:eastAsia="宋体" w:ascii="宋体" w:hAnsi="宋体"/>
                 <w:sz w:val="18"/>
               </w:rPr>
-              <w:t>1.17%</w:t>
+              <w:t>0.71%</w:t>
             </w:r>
           </w:p>
         </w:tc>
@@ -3480,7 +4628,7 @@
                 <w:rFonts w:eastAsia="宋体" w:ascii="宋体" w:hAnsi="宋体"/>
                 <w:sz w:val="18"/>
               </w:rPr>
-              <w:t>-5.51%</w:t>
+              <w:t>-8.21%</w:t>
             </w:r>
           </w:p>
         </w:tc>
@@ -3498,7 +4646,7 @@
                 <w:rFonts w:eastAsia="宋体" w:ascii="宋体" w:hAnsi="宋体"/>
                 <w:sz w:val="18"/>
               </w:rPr>
-              <w:t>-0.0040</w:t>
+              <w:t>-0.0479</w:t>
             </w:r>
           </w:p>
         </w:tc>
@@ -3626,7 +4774,7 @@
                 <w:rFonts w:eastAsia="宋体" w:ascii="宋体" w:hAnsi="宋体"/>
                 <w:sz w:val="18"/>
               </w:rPr>
-              <w:t>8.62%</w:t>
+              <w:t>10.44%</w:t>
             </w:r>
           </w:p>
         </w:tc>
@@ -3644,7 +4792,7 @@
                 <w:rFonts w:eastAsia="宋体" w:ascii="宋体" w:hAnsi="宋体"/>
                 <w:sz w:val="18"/>
               </w:rPr>
-              <w:t>5.35%</w:t>
+              <w:t>6.46%</w:t>
             </w:r>
           </w:p>
         </w:tc>
@@ -3662,7 +4810,7 @@
                 <w:rFonts w:eastAsia="宋体" w:ascii="宋体" w:hAnsi="宋体"/>
                 <w:sz w:val="18"/>
               </w:rPr>
-              <w:t>-4.83%</w:t>
+              <w:t>-10.28%</w:t>
             </w:r>
           </w:p>
         </w:tc>
@@ -3680,7 +4828,7 @@
                 <w:rFonts w:eastAsia="宋体" w:ascii="宋体" w:hAnsi="宋体"/>
                 <w:sz w:val="18"/>
               </w:rPr>
-              <w:t>0.7011</w:t>
+              <w:t>0.5506</w:t>
             </w:r>
           </w:p>
         </w:tc>
@@ -3698,7 +4846,7 @@
                 <w:rFonts w:eastAsia="宋体" w:ascii="宋体" w:hAnsi="宋体"/>
                 <w:sz w:val="18"/>
               </w:rPr>
-              <w:t>66.7%</w:t>
+              <w:t>33.3%</w:t>
             </w:r>
           </w:p>
         </w:tc>
@@ -3808,7 +4956,7 @@
                 <w:rFonts w:eastAsia="宋体" w:ascii="宋体" w:hAnsi="宋体"/>
                 <w:sz w:val="18"/>
               </w:rPr>
-              <w:t>-1.95%</w:t>
+              <w:t>-2.27%</w:t>
             </w:r>
           </w:p>
         </w:tc>
@@ -3826,7 +4974,7 @@
                 <w:rFonts w:eastAsia="宋体" w:ascii="宋体" w:hAnsi="宋体"/>
                 <w:sz w:val="18"/>
               </w:rPr>
-              <w:t>-1.23%</w:t>
+              <w:t>-1.44%</w:t>
             </w:r>
           </w:p>
         </w:tc>
@@ -3862,7 +5010,7 @@
                 <w:rFonts w:eastAsia="宋体" w:ascii="宋体" w:hAnsi="宋体"/>
                 <w:sz w:val="18"/>
               </w:rPr>
-              <w:t>-0.7300</w:t>
+              <w:t>-0.5285</w:t>
             </w:r>
           </w:p>
         </w:tc>
@@ -3990,7 +5138,7 @@
                 <w:rFonts w:eastAsia="宋体" w:ascii="宋体" w:hAnsi="宋体"/>
                 <w:sz w:val="18"/>
               </w:rPr>
-              <w:t>-6.83%</w:t>
+              <w:t>-8.10%</w:t>
             </w:r>
           </w:p>
         </w:tc>
@@ -4008,7 +5156,7 @@
                 <w:rFonts w:eastAsia="宋体" w:ascii="宋体" w:hAnsi="宋体"/>
                 <w:sz w:val="18"/>
               </w:rPr>
-              <w:t>-4.36%</w:t>
+              <w:t>-5.18%</w:t>
             </w:r>
           </w:p>
         </w:tc>
@@ -4026,7 +5174,7 @@
                 <w:rFonts w:eastAsia="宋体" w:ascii="宋体" w:hAnsi="宋体"/>
                 <w:sz w:val="18"/>
               </w:rPr>
-              <w:t>-9.97%</w:t>
+              <w:t>-11.87%</w:t>
             </w:r>
           </w:p>
         </w:tc>
@@ -4044,7 +5192,7 @@
                 <w:rFonts w:eastAsia="宋体" w:ascii="宋体" w:hAnsi="宋体"/>
                 <w:sz w:val="18"/>
               </w:rPr>
-              <w:t>-1.7271</w:t>
+              <w:t>-1.5837</w:t>
             </w:r>
           </w:p>
         </w:tc>
@@ -4172,7 +5320,7 @@
                 <w:rFonts w:eastAsia="宋体" w:ascii="宋体" w:hAnsi="宋体"/>
                 <w:sz w:val="18"/>
               </w:rPr>
-              <w:t>0.06%</w:t>
+              <w:t>-1.07%</w:t>
             </w:r>
           </w:p>
         </w:tc>
@@ -4190,7 +5338,7 @@
                 <w:rFonts w:eastAsia="宋体" w:ascii="宋体" w:hAnsi="宋体"/>
                 <w:sz w:val="18"/>
               </w:rPr>
-              <w:t>0.04%</w:t>
+              <w:t>-0.68%</w:t>
             </w:r>
           </w:p>
         </w:tc>
@@ -4208,7 +5356,7 @@
                 <w:rFonts w:eastAsia="宋体" w:ascii="宋体" w:hAnsi="宋体"/>
                 <w:sz w:val="18"/>
               </w:rPr>
-              <w:t>-6.95%</w:t>
+              <w:t>-9.48%</w:t>
             </w:r>
           </w:p>
         </w:tc>
@@ -4226,7 +5374,7 @@
                 <w:rFonts w:eastAsia="宋体" w:ascii="宋体" w:hAnsi="宋体"/>
                 <w:sz w:val="18"/>
               </w:rPr>
-              <w:t>-0.2899</w:t>
+              <w:t>-0.3074</w:t>
             </w:r>
           </w:p>
         </w:tc>
@@ -4354,7 +5502,7 @@
                 <w:rFonts w:eastAsia="宋体" w:ascii="宋体" w:hAnsi="宋体"/>
                 <w:sz w:val="18"/>
               </w:rPr>
-              <w:t>3.71%</w:t>
+              <w:t>7.42%</w:t>
             </w:r>
           </w:p>
         </w:tc>
@@ -4372,7 +5520,7 @@
                 <w:rFonts w:eastAsia="宋体" w:ascii="宋体" w:hAnsi="宋体"/>
                 <w:sz w:val="18"/>
               </w:rPr>
-              <w:t>2.32%</w:t>
+              <w:t>4.61%</w:t>
             </w:r>
           </w:p>
         </w:tc>
@@ -4390,7 +5538,7 @@
                 <w:rFonts w:eastAsia="宋体" w:ascii="宋体" w:hAnsi="宋体"/>
                 <w:sz w:val="18"/>
               </w:rPr>
-              <w:t>-4.38%</w:t>
+              <w:t>-7.67%</w:t>
             </w:r>
           </w:p>
         </w:tc>
@@ -4408,7 +5556,7 @@
                 <w:rFonts w:eastAsia="宋体" w:ascii="宋体" w:hAnsi="宋体"/>
                 <w:sz w:val="18"/>
               </w:rPr>
-              <w:t>0.2418</w:t>
+              <w:t>0.4129</w:t>
             </w:r>
           </w:p>
         </w:tc>
@@ -4426,7 +5574,7 @@
                 <w:rFonts w:eastAsia="宋体" w:ascii="宋体" w:hAnsi="宋体"/>
                 <w:sz w:val="18"/>
               </w:rPr>
-              <w:t>60.0%</w:t>
+              <w:t>40.0%</w:t>
             </w:r>
           </w:p>
         </w:tc>
@@ -4561,7 +5709,7 @@
           <w:b w:val="0"/>
           <w:sz w:val="21"/>
         </w:rPr>
-        <w:t>本报告以贵州茅台为主要标的，完成了海龟交易策略（System 1: 入场 20 日/离场 10 日/止损 2×ATR）的完整回测分析。策略累计回报 -1.58%，年化 -1.00%，MDD -7.12%，夏普 -0.6660，跑赢买入持有基准。</w:t>
+        <w:t>本报告以贵州茅台为主要标的，完成了海龟交易策略（System 1: 入场 20 日/离场 10 日/止损 2×ATR）的完整回测分析。策略累计回报 -2.21%，年化 -1.40%，MDD -8.60%，夏普 -0.5783，跑赢买入持有基准。</w:t>
       </w:r>
     </w:p>
     <w:p>
@@ -4651,6 +5799,21 @@
           <w:sz w:val="21"/>
         </w:rPr>
         <w:t>5. 心理执行的困难：知道一套策略长期能赚钱，和在连续亏损 10 次后继续执行它是两回事。海龟策略的最大敌人不是市场，而是交易者自身的情绪。Dennis 的学员中，有些人因为无法忍受连续亏损而放弃了系统——这正是机械策略的核心挑战。</w:t>
+      </w:r>
+    </w:p>
+    <w:p>
+      <w:pPr>
+        <w:spacing w:before="0" w:after="0" w:line="360" w:lineRule="auto"/>
+        <w:ind w:firstLine="420"/>
+        <w:jc w:val="both"/>
+      </w:pPr>
+      <w:r>
+        <w:rPr>
+          <w:rFonts w:eastAsia="宋体" w:ascii="宋体" w:hAnsi="宋体"/>
+          <w:b w:val="0"/>
+          <w:sz w:val="21"/>
+        </w:rPr>
+        <w:t>6. 仅做多限制：本策略仅实现做多方向，在持续下跌行情中只能通过空仓减少损失，无法像原版海龟策略（可双向交易）那样通过做空在熊市中获利。在 A 股市场，这是一个实际但重要的约束。若未来扩展到可融券标的或期货市场，应加入做空方向以还原海龟策略的完整设计。</w:t>
       </w:r>
     </w:p>
     <w:p>

</xml_diff>